<commit_message>
Add DTW IT Center PM Dashboard; fix construction budget category totals
- New Streamlit dashboard (dtw-pm-dashboard/) operationalizing the PM
  Toolkit's schedule, budget, risk, stakeholder, and closeout data into
  an interactive portfolio rollup, Gantt view, budget variance charts,
  risk heatmap, stakeholder power/interest grid, and a lessons-learned
  page.
- Fixed construction project budget categories in the PM Tracking
  Workbook and Status/Closeout Report: they previously summed to
  $5.42M against a stated $4.25M GMP total; rebalanced so all
  categories (including contingency) reconcile to $4,250,000 exactly.

Co-Authored-By: Claude Sonnet 5 <noreply@anthropic.com>
</commit_message>
<xml_diff>
--- a/dtw-it-center-pm-toolkit/01-construction-infrastructure-project/03_Status_and_Closeout_Report.docx
+++ b/dtw-it-center-pm-toolkit/01-construction-infrastructure-project/03_Status_and_Closeout_Report.docx
@@ -710,7 +710,7 @@
                 <w:sz w:val="19"/>
                 <w:szCs w:val="19"/>
               </w:rPr>
-              <w:t xml:space="preserve">$1,450,000</w:t>
+              <w:t xml:space="preserve">$1,000,000</w:t>
             </w:r>
           </w:p>
         </w:tc>
@@ -733,7 +733,7 @@
                 <w:sz w:val="19"/>
                 <w:szCs w:val="19"/>
               </w:rPr>
-              <w:t xml:space="preserve">$1,180,000</w:t>
+              <w:t xml:space="preserve">$810,000</w:t>
             </w:r>
           </w:p>
         </w:tc>
@@ -756,7 +756,7 @@
                 <w:sz w:val="19"/>
                 <w:szCs w:val="19"/>
               </w:rPr>
-              <w:t xml:space="preserve">-$270,000</w:t>
+              <w:t xml:space="preserve">-$190,000</w:t>
             </w:r>
           </w:p>
         </w:tc>
@@ -829,7 +829,7 @@
                 <w:sz w:val="19"/>
                 <w:szCs w:val="19"/>
               </w:rPr>
-              <w:t xml:space="preserve">$980,000</w:t>
+              <w:t xml:space="preserve">$780,000</w:t>
             </w:r>
           </w:p>
         </w:tc>
@@ -853,7 +853,7 @@
                 <w:sz w:val="19"/>
                 <w:szCs w:val="19"/>
               </w:rPr>
-              <w:t xml:space="preserve">$640,000</w:t>
+              <w:t xml:space="preserve">$507,000</w:t>
             </w:r>
           </w:p>
         </w:tc>
@@ -877,7 +877,7 @@
                 <w:sz w:val="19"/>
                 <w:szCs w:val="19"/>
               </w:rPr>
-              <w:t xml:space="preserve">-$340,000</w:t>
+              <w:t xml:space="preserve">-$273,000</w:t>
             </w:r>
           </w:p>
         </w:tc>
@@ -949,7 +949,7 @@
                 <w:sz w:val="19"/>
                 <w:szCs w:val="19"/>
               </w:rPr>
-              <w:t xml:space="preserve">$1,020,000</w:t>
+              <w:t xml:space="preserve">$1,500,000</w:t>
             </w:r>
           </w:p>
         </w:tc>
@@ -972,7 +972,7 @@
                 <w:sz w:val="19"/>
                 <w:szCs w:val="19"/>
               </w:rPr>
-              <w:t xml:space="preserve">$1,005,000</w:t>
+              <w:t xml:space="preserve">$1,483,000</w:t>
             </w:r>
           </w:p>
         </w:tc>
@@ -995,7 +995,7 @@
                 <w:sz w:val="19"/>
                 <w:szCs w:val="19"/>
               </w:rPr>
-              <w:t xml:space="preserve">-$15,000</w:t>
+              <w:t xml:space="preserve">-$17,000</w:t>
             </w:r>
           </w:p>
         </w:tc>

</xml_diff>